<commit_message>
made changes to working notes and created observation notes to document what i see in each report
</commit_message>
<xml_diff>
--- a/data/notes/working note.docx
+++ b/data/notes/working note.docx
@@ -39,31 +39,7 @@
                 <w:sz w:val="24"/>
                 <w:szCs w:val="24"/>
               </w:rPr>
-              <w:t xml:space="preserve">Report </w:t>
-            </w:r>
-            <w:r>
-              <w:rPr>
-                <w:rFonts w:ascii="Times New Roman" w:eastAsia="Times New Roman" w:hAnsi="Times New Roman" w:cs="Times New Roman"/>
-                <w:sz w:val="24"/>
-                <w:szCs w:val="24"/>
-              </w:rPr>
-              <w:t>period</w:t>
-            </w:r>
-            <w:r>
-              <w:rPr>
-                <w:rFonts w:ascii="Times New Roman" w:eastAsia="Times New Roman" w:hAnsi="Times New Roman" w:cs="Times New Roman"/>
-                <w:sz w:val="24"/>
-                <w:szCs w:val="24"/>
-              </w:rPr>
-              <w:t xml:space="preserve"> shown</w:t>
-            </w:r>
-            <w:r>
-              <w:rPr>
-                <w:rFonts w:ascii="Times New Roman" w:eastAsia="Times New Roman" w:hAnsi="Times New Roman" w:cs="Times New Roman"/>
-                <w:sz w:val="24"/>
-                <w:szCs w:val="24"/>
-              </w:rPr>
-              <w:t xml:space="preserve"> </w:t>
+              <w:t xml:space="preserve">Report period shown </w:t>
             </w:r>
           </w:p>
         </w:tc>
@@ -1215,51 +1191,6 @@
         </w:tc>
       </w:tr>
     </w:tbl>
-    <w:p>
-      <w:pPr>
-        <w:rPr>
-          <w:rFonts w:ascii="Times New Roman" w:hAnsi="Times New Roman" w:cs="Times New Roman"/>
-          <w:sz w:val="24"/>
-          <w:szCs w:val="24"/>
-        </w:rPr>
-      </w:pPr>
-    </w:p>
-    <w:p>
-      <w:pPr>
-        <w:rPr>
-          <w:rFonts w:ascii="Times New Roman" w:hAnsi="Times New Roman" w:cs="Times New Roman"/>
-          <w:sz w:val="24"/>
-          <w:szCs w:val="24"/>
-        </w:rPr>
-      </w:pPr>
-    </w:p>
-    <w:p>
-      <w:pPr>
-        <w:rPr>
-          <w:rFonts w:ascii="Times New Roman" w:hAnsi="Times New Roman" w:cs="Times New Roman"/>
-          <w:sz w:val="24"/>
-          <w:szCs w:val="24"/>
-        </w:rPr>
-      </w:pPr>
-    </w:p>
-    <w:p>
-      <w:pPr>
-        <w:rPr>
-          <w:rFonts w:ascii="Times New Roman" w:hAnsi="Times New Roman" w:cs="Times New Roman"/>
-          <w:sz w:val="24"/>
-          <w:szCs w:val="24"/>
-        </w:rPr>
-      </w:pPr>
-    </w:p>
-    <w:p>
-      <w:pPr>
-        <w:rPr>
-          <w:rFonts w:ascii="Times New Roman" w:hAnsi="Times New Roman" w:cs="Times New Roman"/>
-          <w:sz w:val="24"/>
-          <w:szCs w:val="24"/>
-        </w:rPr>
-      </w:pPr>
-    </w:p>
     <w:p>
       <w:pPr>
         <w:rPr>
@@ -1892,6 +1823,22 @@
       </w:tblBorders>
     </w:tblPr>
   </w:style>
+  <w:style w:type="paragraph" w:customStyle="1" w:styleId="Default">
+    <w:name w:val="Default"/>
+    <w:rsid w:val="0017408F"/>
+    <w:pPr>
+      <w:autoSpaceDE w:val="0"/>
+      <w:autoSpaceDN w:val="0"/>
+      <w:adjustRightInd w:val="0"/>
+      <w:spacing w:after="0" w:line="240" w:lineRule="auto"/>
+    </w:pPr>
+    <w:rPr>
+      <w:rFonts w:ascii="Myanmar Text" w:hAnsi="Myanmar Text" w:cs="Myanmar Text"/>
+      <w:color w:val="000000"/>
+      <w:sz w:val="24"/>
+      <w:szCs w:val="24"/>
+    </w:rPr>
+  </w:style>
 </w:styles>
 </file>
 

</xml_diff>